<commit_message>
CRM-13: add report PDFs and stakeholder feedback document
</commit_message>
<xml_diff>
--- a/deliverables/Report.docx
+++ b/deliverables/Report.docx
@@ -1841,7 +1841,7 @@
         <w:rPr>
           <w:b w:val="0"/>
         </w:rPr>
-        <w:t>Feedback records: docs/evidence/stakeholder_feedback.json. Scientific and product context: [L03, L06, L08, S01–S06].</w:t>
+        <w:t>Feedback records: deliverables/Stakeholder_Feedback.docx. Scientific and product context: [L03, L06, L08, S01–S06].</w:t>
       </w:r>
     </w:p>
     <w:p>
@@ -13335,7 +13335,7 @@
         <w:rPr>
           <w:b w:val="0"/>
         </w:rPr>
-        <w:t>Each change links to a YouTrack issue and includes relevant checks. A second team member reviews the PR before merge. The final checkpoint tag identifies the selected submission commit.</w:t>
+        <w:t>Each change links to a YouTrack issue and includes relevant checks. A second team member reviews the PR before merge. After review, place prob-period-1 and pre-defense-1 on the same selected submission commit and export the PDFs from that version.</w:t>
       </w:r>
     </w:p>
     <w:p>

</xml_diff>

<commit_message>
CRM-7: clarify API access and analysis job flow
</commit_message>
<xml_diff>
--- a/deliverables/Report.docx
+++ b/deliverables/Report.docx
@@ -8632,7 +8632,7 @@
       <w:r>
         <w:drawing>
           <wp:inline xmlns:a="http://schemas.openxmlformats.org/drawingml/2006/main" xmlns:pic="http://schemas.openxmlformats.org/drawingml/2006/picture">
-            <wp:extent cx="6400800" cy="4373880"/>
+            <wp:extent cx="6400800" cy="6741583"/>
             <wp:docPr id="3" name="Picture 3"/>
             <wp:cNvGraphicFramePr>
               <a:graphicFrameLocks noChangeAspect="1"/>
@@ -8653,7 +8653,7 @@
                   <pic:spPr>
                     <a:xfrm>
                       <a:off x="0" y="0"/>
-                      <a:ext cx="6400800" cy="4373880"/>
+                      <a:ext cx="6400800" cy="6741583"/>
                     </a:xfrm>
                     <a:prstGeom prst="rect"/>
                   </pic:spPr>

</xml_diff>

<commit_message>
CRM-13: update diploma project title
</commit_message>
<xml_diff>
--- a/deliverables/Report.docx
+++ b/deliverables/Report.docx
@@ -22,7 +22,7 @@
         <w:rPr>
           <w:b w:val="0"/>
         </w:rPr>
-        <w:t>Development of an Intelligent CRM Platform with Automated Customer Interaction Analysis</w:t>
+        <w:t>Development of an intelligent CRM platform for automated analysis of customer interactions</w:t>
       </w:r>
     </w:p>
     <w:p>
@@ -535,7 +535,7 @@
         <w:rPr>
           <w:b w:val="0"/>
         </w:rPr>
-        <w:t>Development of an Intelligent CRM Platform with Automated Customer Interaction Analysis</w:t>
+        <w:t>Development of an intelligent CRM platform for automated analysis of customer interactions</w:t>
       </w:r>
     </w:p>
     <w:p>

</xml_diff>

<commit_message>
CRM-13: add supervisor feedback and submission evidence
</commit_message>
<xml_diff>
--- a/deliverables/Report.docx
+++ b/deliverables/Report.docx
@@ -487,10 +487,15 @@
         <w:widowControl/>
       </w:pPr>
       <w:r>
-        <w:rPr>
-          <w:b w:val="0"/>
-        </w:rPr>
-        <w:t>11 Source register</w:t>
+        <w:t>11 Supervisor feedback</w:t>
+      </w:r>
+    </w:p>
+    <w:p>
+      <w:pPr>
+        <w:widowControl/>
+      </w:pPr>
+      <w:r>
+        <w:t>12 Source register</w:t>
       </w:r>
     </w:p>
     <w:p>
@@ -688,7 +693,9 @@
                 <w:b w:val="0"/>
                 <w:sz w:val="20"/>
               </w:rPr>
-              <w:t>Frontend and visualisation</w:t>
+              <w:t>Frontend and visualisation. Added the shared runnable browser prototype, report and stakeholder-feedback bundle.</w:t>
+              <w:br/>
+              <w:t>PR #4; commit 22e2cebb31a834833fa5ad91a9bdffacfcfb9d9b.</w:t>
             </w:r>
           </w:p>
         </w:tc>
@@ -753,7 +760,9 @@
                 <w:b w:val="0"/>
                 <w:sz w:val="20"/>
               </w:rPr>
-              <w:t>Backend and integrations</w:t>
+              <w:t>Backend and integrations. Clarified API access checks, durable jobs and UI status polling in the component diagram and matching report.</w:t>
+              <w:br/>
+              <w:t>CRM-7, PR #7; commit 2c7deeaba6391ee4bf2936362cdda91d843ede24.</w:t>
             </w:r>
           </w:p>
         </w:tc>
@@ -818,7 +827,9 @@
                 <w:b w:val="0"/>
                 <w:sz w:val="20"/>
               </w:rPr>
-              <w:t>AI/NLP, evaluation and QA</w:t>
+              <w:t>AI/NLP, evaluation and QA. Updated topic matching to exclude speaker names and added validation for blank required fields.</w:t>
+              <w:br/>
+              <w:t>CRM-9, PR #5; commit eaa3af4c978c096b5c2661621d7b420d1e0c1026.</w:t>
             </w:r>
           </w:p>
         </w:tc>
@@ -5927,10 +5938,7 @@
         <w:widowControl/>
       </w:pPr>
       <w:r>
-        <w:rPr>
-          <w:b w:val="0"/>
-        </w:rPr>
-        <w:t>Five key decisions each have three alternatives. Selection criteria are requirement fit, team maintainability, reproducible evaluation, operational simplicity, data handling and resource constraints. Ratings below are qualitative design judgements, not measured performance rankings. All choices are proposed and require team/supervisor review.</w:t>
+        <w:t>Five key decisions each have three alternatives. Selection criteria are requirement fit, team maintainability, reproducible evaluation, operational simplicity, data handling and resource constraints. Ratings below are qualitative design judgements, not measured performance rankings. All choices are proposed; the supervisor's stage feedback and next-stage recommendations are recorded in Section 11.</w:t>
       </w:r>
     </w:p>
     <w:p>
@@ -6515,10 +6523,7 @@
         <w:spacing w:line="242" w:lineRule="auto" w:after="40"/>
       </w:pPr>
       <w:r>
-        <w:rPr>
-          <w:b w:val="0"/>
-        </w:rPr>
-        <w:t>This is a testable initial baseline proposed by the team. User validation and supervisor review remain open. Must is mandatory for the diploma MVP, Should follows mandatory scenarios, Could is optional. The browser prototype demonstrates selected UI flows only and does not satisfy server-side access or persistence requirements.</w:t>
+        <w:t>This is a testable initial baseline proposed by the team. User validation remains planned; supervisor feedback is recorded in Section 11. Must is mandatory for the diploma MVP, Should follows mandatory scenarios, Could is optional. The browser prototype demonstrates selected UI flows only and does not satisfy server-side access or persistence requirements.</w:t>
       </w:r>
     </w:p>
     <w:p>
@@ -8454,10 +8459,25 @@
         <w:widowControl/>
       </w:pPr>
       <w:r>
-        <w:rPr>
-          <w:b w:val="0"/>
-        </w:rPr>
-        <w:t>System context: diagrams/src/context.puml and readable exports. Use cases: diagrams/src/use-cases.puml with UML actors, system boundary and explicit included/extended behaviour. Draft components: diagrams/src/components.puml. Additional sequence/data diagrams may follow during implementation. The required diagrams describe the proposed architecture and are not evidence that components already run.</w:t>
+        <w:t>Editable PlantUML sources for the system context, use cases and components:</w:t>
+      </w:r>
+      <w:r>
+        <w:br/>
+        <w:t/>
+      </w:r>
+      <w:hyperlink r:id="rId14">
+        <w:r>
+          <w:rPr>
+            <w:color w:val="0563C1"/>
+            <w:u w:val="single"/>
+            <w:sz w:val="21"/>
+          </w:rPr>
+          <w:t>https://github.com/dinfy07/intelligent-crm-platform/tree/prob-period-1/diagrams/src</w:t>
+        </w:r>
+      </w:hyperlink>
+      <w:r>
+        <w:br/>
+        <w:t>Readable exports are in diagrams/exports. These diagrams describe the proposed architecture, not deployed components.</w:t>
       </w:r>
     </w:p>
     <w:p>
@@ -8732,10 +8752,25 @@
         <w:widowControl/>
       </w:pPr>
       <w:r>
-        <w:rPr>
-          <w:b w:val="0"/>
-        </w:rPr>
-        <w:t>Open prototype/index.html directly, or run python3 -m http.server 9137 --directory prototype. The prototype runs locally without network calls or external libraries. Fictional fixtures demonstrate customers, interaction text, topic tagging, extractive summaries, source references, review/edit/approve/reject, a failed-analysis recovery state, search, filters and JSON export. Data persist only in the browser's local storage where available. Reset restores fictional examples.</w:t>
+        <w:t>Download the prototype folder and follow README to run it:</w:t>
+      </w:r>
+      <w:r>
+        <w:br/>
+        <w:t/>
+      </w:r>
+      <w:hyperlink r:id="rId15">
+        <w:r>
+          <w:rPr>
+            <w:color w:val="0563C1"/>
+            <w:u w:val="single"/>
+            <w:sz w:val="21"/>
+          </w:rPr>
+          <w:t>https://github.com/dinfy07/intelligent-crm-platform/blob/prob-period-1/prototype/index.html</w:t>
+        </w:r>
+      </w:hyperlink>
+      <w:r>
+        <w:br/>
+        <w:t>The prototype runs locally without network calls or external libraries. Fictional fixtures demonstrate customers, interaction text, topic tagging, extractive summaries, source references, review/edit/approve/reject, a failed-analysis recovery state, search, filters and JSON export. Data persist only in the browser's local storage where available. Reset restores fictional examples.</w:t>
       </w:r>
     </w:p>
     <w:p>
@@ -12941,7 +12976,7 @@
                 <w:b w:val="0"/>
                 <w:sz w:val="20"/>
               </w:rPr>
-              <w:t>Missing supervisor evidence or tracker follow-through</w:t>
+              <w:t>Supervisor recommendations not followed through</w:t>
             </w:r>
           </w:p>
         </w:tc>
@@ -13031,7 +13066,7 @@
                 <w:b w:val="0"/>
                 <w:sz w:val="20"/>
               </w:rPr>
-              <w:t>Tracker is configured; verify invitation acceptance and request substantive supervisor review. Record the review outcome and required revisions.</w:t>
+              <w:t>Supervisor feedback was received on 24 October. Track backend/AI implementation, evaluation and code-review follow-up in YouTrack.</w:t>
             </w:r>
           </w:p>
         </w:tc>
@@ -13335,7 +13370,7 @@
         <w:rPr>
           <w:b w:val="0"/>
         </w:rPr>
-        <w:t>Each change links to a YouTrack issue and includes relevant checks. A second team member reviews the PR before merge. After review, place prob-period-1 and pre-defense-1 on the same selected submission commit and export the PDFs from that version.</w:t>
+        <w:t>Each change links to a YouTrack issue and includes relevant checks. A second team member reviews the PR before merge. Use prob-period-1 for the final form-submission version and export the PDFs from that version. Retain pre-defense-1 on the earlier checkpoint without moving it.</w:t>
       </w:r>
     </w:p>
     <w:p>
@@ -13362,20 +13397,146 @@
       </w:r>
     </w:p>
     <w:p>
-      <w:r>
-        <w:br w:type="page"/>
-      </w:r>
+      <w:pPr>
+        <w:widowControl/>
+      </w:pPr>
+      <w:r>
+        <w:t>Anonymous stakeholder feedback:</w:t>
+      </w:r>
+      <w:r>
+        <w:br/>
+        <w:t/>
+      </w:r>
+      <w:hyperlink r:id="rId16">
+        <w:r>
+          <w:rPr>
+            <w:color w:val="0563C1"/>
+            <w:u w:val="single"/>
+            <w:sz w:val="21"/>
+          </w:rPr>
+          <w:t>https://github.com/dinfy07/intelligent-crm-platform/blob/prob-period-1/deliverables/Stakeholder_Feedback.docx</w:t>
+        </w:r>
+      </w:hyperlink>
+    </w:p>
+    <w:p>
+      <w:pPr>
+        <w:widowControl/>
+      </w:pPr>
+      <w:r>
+        <w:t>YouTrack task export:</w:t>
+      </w:r>
+      <w:r>
+        <w:br/>
+        <w:t/>
+      </w:r>
+      <w:hyperlink r:id="rId17">
+        <w:r>
+          <w:rPr>
+            <w:color w:val="0563C1"/>
+            <w:u w:val="single"/>
+            <w:sz w:val="21"/>
+          </w:rPr>
+          <w:t>https://github.com/dinfy07/intelligent-crm-platform/blob/prob-period-1/deliverables/YouTrack.pdf</w:t>
+        </w:r>
+      </w:hyperlink>
     </w:p>
     <w:p>
       <w:pPr>
         <w:pStyle w:val="Heading1"/>
         <w:widowControl/>
-      </w:pPr>
-      <w:r>
-        <w:rPr>
-          <w:b w:val="0"/>
-        </w:rPr>
-        <w:t>11 Source register</w:t>
+        <w:pageBreakBefore/>
+      </w:pPr>
+      <w:r>
+        <w:t>11 Supervisor feedback</w:t>
+      </w:r>
+    </w:p>
+    <w:p>
+      <w:pPr>
+        <w:widowControl/>
+      </w:pPr>
+      <w:r>
+        <w:rPr>
+          <w:b w:val="0"/>
+        </w:rPr>
+        <w:t>Arailym Orazova | 24 October 2026 | Telegram</w:t>
+      </w:r>
+    </w:p>
+    <w:p>
+      <w:pPr>
+        <w:pStyle w:val="Heading2"/>
+        <w:widowControl/>
+      </w:pPr>
+      <w:r>
+        <w:rPr>
+          <w:b w:val="0"/>
+        </w:rPr>
+        <w:t>Supervisor assessment</w:t>
+      </w:r>
+    </w:p>
+    <w:p>
+      <w:pPr>
+        <w:widowControl/>
+      </w:pPr>
+      <w:r>
+        <w:rPr>
+          <w:b w:val="0"/>
+        </w:rPr>
+        <w:t>The team has made good progress in project analysis, literature review, requirements specification, system design, and prototype development. The report is well structured and generally meets the objectives of the current stage. For the next stage, the team should focus on backend and AI/NLP implementation, evaluating the accuracy and usefulness of interaction analysis, and strengthening development tracking and collaborative code review practices.</w:t>
+      </w:r>
+    </w:p>
+    <w:p>
+      <w:pPr>
+        <w:widowControl/>
+      </w:pPr>
+      <w:r>
+        <w:rPr>
+          <w:b w:val="0"/>
+        </w:rPr>
+        <w:t>The supervisor also requested that actual individual contributions be stated in the report and README and supported by the GitHub history. The contribution table in Section 1 records the corresponding pull requests and commits.</w:t>
+      </w:r>
+    </w:p>
+    <w:p>
+      <w:pPr>
+        <w:pStyle w:val="Heading2"/>
+        <w:widowControl/>
+      </w:pPr>
+      <w:r>
+        <w:rPr>
+          <w:b w:val="0"/>
+        </w:rPr>
+        <w:t>Response and next-stage work</w:t>
+      </w:r>
+    </w:p>
+    <w:p>
+      <w:pPr>
+        <w:widowControl/>
+      </w:pPr>
+      <w:r>
+        <w:rPr>
+          <w:b w:val="0"/>
+        </w:rPr>
+        <w:t>Danial will implement API access checks, durable job persistence and status endpoints. Beybit will connect the Vue interface to the backend. Akhmediyar will implement and evaluate AI/NLP analysis using the proposed factuality, topic-quality and user-task measures. These implementation and evaluation activities remain planned.</w:t>
+      </w:r>
+    </w:p>
+    <w:p>
+      <w:pPr>
+        <w:widowControl/>
+      </w:pPr>
+      <w:r>
+        <w:rPr>
+          <w:b w:val="0"/>
+        </w:rPr>
+        <w:t>The team will link implementation work to YouTrack issues and use pull requests and peer review to track and discuss changes. The existing browser prototype, architecture clarification and topic-matching changes provide the current baseline; the next stage will extend it with backend and AI/NLP functionality.</w:t>
+      </w:r>
+    </w:p>
+    <w:p>
+      <w:pPr>
+        <w:pStyle w:val="Heading1"/>
+        <w:widowControl/>
+        <w:pageBreakBefore/>
+      </w:pPr>
+      <w:r>
+        <w:t>12 Source register</w:t>
       </w:r>
     </w:p>
     <w:p>

</xml_diff>